<commit_message>
Paper v2 revision: humanizer pass on abstract, results, discussion, conclusion
Co-Authored-By: Claude Sonnet 5.5 <noreply@anthropic.com>
</commit_message>
<xml_diff>
--- a/paper/revisions/2026-10-24/kisaniti_rp_v2_revised.docx
+++ b/paper/revisions/2026-10-24/kisaniti_rp_v2_revised.docx
@@ -138,7 +138,7 @@
           <w:szCs w:val="18"/>
           <w:rFonts w:ascii="Times New Roman" w:cs="Times New Roman" w:eastAsia="Times New Roman" w:hAnsi="Times New Roman"/>
         </w:rPr>
-        <w:t xml:space="preserve">After harvest, a Farmer Producer Organization (FPO) must still decide where, when and how much of its members' produce is to be sold. A decision-support framework, KisanNiti, is presented for this task. It joins mandi price forecasting, storage sensing and a cooperative allocation model. Mandi prices from AGMARKNET are treated as a network of markets and forecast with an attention temporal graph convolutional network (A3T-GCN). Storage conditions are to be recorded by a low-cost node made of an ESP32 board and an SHT30 temperature and humidity probe placed in the grain. An integer program assigns every farmer lot to a mandi, a day and a quantity, and all lots share the daily limit of each mandi. The forecasting and allocation parts were tested on real Paddy (Common) prices from 20 Punjab mandis for the 2020–2025 seasons. In every season, more than 96% of the reported prices were equal to the minimum support price (MSP). A simple MSP rule therefore gave the lowest forecast error (mean absolute error of Rs. 1.26 per quintal), and no learned model beat it. In a synthetic 40-lot FPO scenario, the cooperative plan respected every daily limit, whereas independent choices exceeded a limit in every run. The gain of the plan over a nearest-mandi rule was small (Rs. 0.79 per quintal) when limits were loose and rose to Rs. 3.5–13.9 per quintal when they were tight.</w:t>
+        <w:t xml:space="preserve">Even after harvest, a Farmer Producer Organization (FPO) has to settle where, when and how much of its members' produce is sold. KisanNiti, a decision-support framework for this task, is presented. Mandi price forecasting, storage sensing and a cooperative allocation model are combined in it. Mandi prices from AGMARKNET are treated as a network of markets and forecast with an attention temporal graph convolutional network (A3T-GCN). Storage conditions are to be recorded by a low-cost node made of an ESP32 board and an SHT30 temperature and humidity probe placed in the grain. An integer program assigns every farmer lot to a mandi, a day and a quantity, and all lots share the daily limit of each mandi. The forecasting and allocation parts were tested on real Paddy (Common) prices from 20 Punjab mandis for the 2020–2025 seasons. In every season, more than 96% of the reported prices were equal to the minimum support price (MSP). A simple MSP rule therefore gave the lowest forecast error (mean absolute error of Rs. 1.26 per quintal), and no learned model beat it. In a synthetic 40-lot FPO scenario, the cooperative plan respected every daily limit, whereas independent choices exceeded a limit in every run. The gain of the plan over a nearest-mandi rule was small (Rs. 0.79 per quintal) when limits were loose and rose to Rs. 3.5–13.9 per quintal when they were tight.</w:t>
       </w:r>
     </w:p>
     <w:p>
@@ -7299,7 +7299,7 @@
           <w:szCs w:val="20"/>
           <w:rFonts w:ascii="Times New Roman" w:cs="Times New Roman" w:eastAsia="Times New Roman" w:hAnsi="Times New Roman"/>
         </w:rPr>
-        <w:t xml:space="preserve">The results are given in Table 3. Validation selected </w:t>
+        <w:t xml:space="preserve">Table 3 gives the results. Validation selected </w:t>
       </w:r>
       <w:r>
         <w:rPr>
@@ -7335,7 +7335,7 @@
           <w:szCs w:val="20"/>
           <w:rFonts w:ascii="Times New Roman" w:cs="Times New Roman" w:eastAsia="Times New Roman" w:hAnsi="Times New Roman"/>
         </w:rPr>
-        <w:t xml:space="preserve"> = 3 for 2024 and 2025. All errors are small, below Rs. 7 per quintal on average, because the prices hardly move. The lowest MAE in all three seasons came from the MSP rule (mean Rs. 1.26 per quintal), which also had the lowest RMSE. The naive forecast was second (Rs. 1.77). Among the learned models, the most accurate was A3T-GCN (Rs. 2.36), followed by the GRU (Rs. 2.51), T-GCN (Rs. 2.54) and ridge regression (Rs. 4.09). Compared with a plain GRU, nothing was gained from the graph alone (T-GCN), and the small edge of A3T-GCN is about as large as the variation between random seeds. The two simplest rules were not beaten by any learned model.</w:t>
+        <w:t xml:space="preserve"> = 3 for 2024 and 2025. All errors are small, below Rs. 7 per quintal on average, because the prices hardly move. The lowest MAE in all three seasons came from the MSP rule (mean Rs. 1.26 per quintal), which also had the lowest RMSE. The naive forecast was second (Rs. 1.77). Among the learned models, the most accurate was A3T-GCN (Rs. 2.36), followed by the GRU (Rs. 2.51), T-GCN (Rs. 2.54) and ridge regression (Rs. 4.09). The graph alone (T-GCN) gave nothing over a plain GRU, and the small edge of A3T-GCN is about the size of the variation between random seeds. No learned model beat the two simplest rules.</w:t>
       </w:r>
     </w:p>
     <w:p>
@@ -10450,7 +10450,7 @@
           <w:szCs w:val="20"/>
           <w:rFonts w:ascii="Times New Roman" w:cs="Times New Roman" w:eastAsia="Times New Roman" w:hAnsi="Times New Roman"/>
         </w:rPr>
-        <w:t xml:space="preserve">Three results can be read from Table 4. First, independent choices (P2) do not work for a cooperative. When every lot goes to its own best option, almost all of the produce reaches the nearest mandis on the first day, and the daily limits were exceeded in all 160 runs (on two mandi-days per run on average). Second, every limit was respected by the cooperative model (P3), and Rs. 0.79 per quintal more than the nearest-mandi rule was earned, mostly by reducing travel and waiting. This gain is small and varies between runs (standard deviation Rs. 1.05). Third, the plan was hardly changed by the forecast: P3 with the MSP rule, P3 with A3T-GCN and the perfect-foresight bound were within Rs. 0.01 per quintal of each other, because the prices at the five mandis were nearly the same.</w:t>
+        <w:t xml:space="preserve">Table 4 shows three things. Independent choices (P2) do not suit a cooperative: when every lot goes to its own best option, almost all produce reaches the nearest mandis on the first day, and the daily limits were exceeded in all 160 runs (on two mandi-days per run on average). The cooperative model (P3) respected every limit and earned Rs. 0.79 per quintal more than the nearest-mandi rule, mostly through less travel and waiting. That gain is small and varies between runs (standard deviation Rs. 1.05). The forecast, finally, hardly changed the plan: P3 with the MSP rule, P3 with A3T-GCN and the perfect-foresight bound were within Rs. 0.01 per quintal of each other, because the prices at the five mandis were nearly the same.</w:t>
       </w:r>
     </w:p>
     <w:p>
@@ -10567,7 +10567,7 @@
           <w:szCs w:val="20"/>
           <w:rFonts w:ascii="Times New Roman" w:cs="Times New Roman" w:eastAsia="Times New Roman" w:hAnsi="Times New Roman"/>
         </w:rPr>
-        <w:t xml:space="preserve">One lesson stands out from this first version. For an MSP crop such as Paddy (Common) in Punjab, mandi prices are almost fixed by policy, so a complex forecaster adds nothing, and the announced MSP should be used as the price. For such crops, the value of KisanNiti lies in coordination, that is, in spreading deliveries across mandis and days so that limits are respected and travel is reduced. The forecasting branch is more likely to matter for crops with market-set prices, such as basmati paddy or wheat held on the farm after harvest, and testing it on those crops is the next step.</w:t>
+        <w:t xml:space="preserve">The first version teaches one clear lesson. Mandi prices of an MSP crop such as Paddy (Common) in Punjab are almost fixed by policy, so a complex forecaster adds nothing and the announced MSP can serve as the price. What remains useful for such crops is coordination: deliveries are spread over mandis and days, limits are kept, and travel is reduced. The forecasting branch is more likely to matter for crops with market-set prices, such as basmati paddy or wheat held on the farm after harvest, and testing it on those crops is the next step.</w:t>
       </w:r>
     </w:p>
     <w:p>
@@ -10627,7 +10627,7 @@
           <w:szCs w:val="20"/>
           <w:rFonts w:ascii="Times New Roman" w:cs="Times New Roman" w:eastAsia="Times New Roman" w:hAnsi="Times New Roman"/>
         </w:rPr>
-        <w:t xml:space="preserve">Two findings stand out. First, the price of this crop is fixed almost completely by the MSP: more than 96% of the reported prices were equal to the MSP in every season, and the announced MSP was a better forecast than every learned model, including A3T-GCN. A forecasting system for FPOs should therefore check whether a crop is sold at the MSP before a learned model is used, and the announced MSP should be used when it is. Second, the shared daily limits were always respected by the cooperative allocation model, while they were broken in every run by independent choices. Its gain over sending each lot to the nearest mandi was small when the limits were loose (Rs. 0.79 per quintal) and grew to Rs. 3.5–13.9 per quintal when they were tight. For MSP crops, the main value of KisanNiti is thus coordination and not price prediction.</w:t>
+        <w:t xml:space="preserve">Two results were obtained. The price of this crop is set almost entirely by the MSP: in every season, more than 96% of the reported prices were equal to it, and the announced MSP forecast better than every learned model, A3T-GCN included. A forecasting system for FPOs should check whether a crop is sold at the MSP before any learned model is used, and the announced MSP should be taken as the price if it is. The cooperative allocation model, in turn, respected the shared daily limits every time, while independent choices broke them in every run. Its gain over the nearest-mandi rule was small with loose limits (Rs. 0.79 per quintal) and grew to Rs. 3.5–13.9 per quintal with tight ones. For MSP crops, KisanNiti therefore helps through coordination, not through price prediction.</w:t>
       </w:r>
     </w:p>
     <w:p>

</xml_diff>